<commit_message>
update: refine Word templates and update gitignore
</commit_message>
<xml_diff>
--- a/templates/Annex2_TEMPLATE.docx
+++ b/templates/Annex2_TEMPLATE.docx
@@ -334,7 +334,7 @@
           <w:b/>
           <w:sz w:val="24"/>
         </w:rPr>
-        <w:t xml:space="preserve">Ghar: Muft</w:t>
+        <w:t>Ghar: Muft</w:t>
       </w:r>
       <w:r>
         <w:rPr>
@@ -408,7 +408,7 @@
         <w:t xml:space="preserve"> </w:t>
       </w:r>
       <w:r>
-        <w:t xml:space="preserve">{{ execution_date_text }}</w:t>
+        <w:t>{{ execution_date_text }}</w:t>
       </w:r>
       <w:r>
         <w:rPr>
@@ -570,7 +570,7 @@
         <w:t xml:space="preserve"> </w:t>
       </w:r>
       <w:r>
-        <w:t xml:space="preserve">Surya Ghar:</w:t>
+        <w:t>Surya Ghar:</w:t>
       </w:r>
       <w:r>
         <w:rPr>
@@ -626,7 +626,7 @@
         <w:ind w:left="119"/>
       </w:pPr>
       <w:r>
-        <w:t xml:space="preserve">Mr {{ consumer_name }}   having Address  {{ install_address }} Registered Consumer Number {{ consumer_number }}.</w:t>
+        <w:t>Mr {{ consumer_name }}   having Address  {{ install_address }} Registered Consumer Number {{ consumer_number }}.</w:t>
       </w:r>
     </w:p>
     <w:p>
@@ -676,7 +676,7 @@
         <w:ind w:left="119"/>
       </w:pPr>
       <w:r>
-        <w:t xml:space="preserve">{{ vendor_name_full }} having registered office at {{ vendor_address }}.</w:t>
+        <w:t>{{ vendor_name_full }} having registered office at {{ vendor_address }}.</w:t>
       </w:r>
     </w:p>
     <w:p>
@@ -1247,7 +1247,7 @@
         <w:t xml:space="preserve"> </w:t>
       </w:r>
       <w:r>
-        <w:t xml:space="preserve">test, commission and carry out Operation &amp; Maintenance of the Rooftop Solar plant for 5 year</w:t>
+        <w:t>test, commission and carry out Operation &amp; Maintenance of the Rooftop Solar plant for 5 year</w:t>
       </w:r>
       <w:r>
         <w:rPr>
@@ -3515,7 +3515,6 @@
         <w:rPr>
           <w:sz w:val="24"/>
         </w:rPr>
-        <w:lastRenderedPageBreak/>
         <w:t>of</w:t>
       </w:r>
       <w:r>
@@ -3565,6 +3564,7 @@
           <w:b/>
           <w:sz w:val="24"/>
         </w:rPr>
+        <w:lastRenderedPageBreak/>
         <w:t>Module</w:t>
       </w:r>
       <w:r>
@@ -5697,7 +5697,6 @@
         <w:rPr>
           <w:sz w:val="24"/>
         </w:rPr>
-        <w:lastRenderedPageBreak/>
         <w:t>commissioning</w:t>
       </w:r>
       <w:r>
@@ -5826,6 +5825,7 @@
           <w:b/>
           <w:sz w:val="24"/>
         </w:rPr>
+        <w:lastRenderedPageBreak/>
         <w:t xml:space="preserve">Applicable Standard: </w:t>
       </w:r>
       <w:r>
@@ -6515,7 +6515,7 @@
         <w:rPr>
           <w:sz w:val="24"/>
         </w:rPr>
-        <w:t xml:space="preserve">commissioning of the project by DISCOM or its authorised agency. Vendor must provide</w:t>
+        <w:t>commissioning of the project by DISCOM or its authorised agency. Vendor must provide</w:t>
       </w:r>
       <w:r>
         <w:rPr>
@@ -7018,6 +7018,12 @@
           <w:sz w:val="24"/>
         </w:rPr>
         <w:t>Party</w:t>
+      </w:r>
+      <w:r>
+        <w:rPr>
+          <w:b/>
+          <w:sz w:val="24"/>
+        </w:rPr>
         <w:tab/>
         <w:t>Second</w:t>
       </w:r>
@@ -7056,7 +7062,7 @@
         <w:ind w:left="119"/>
       </w:pPr>
       <w:r>
-        <w:t xml:space="preserve">Name Mr {{ consumer_name }}                                        Name: {{ vendor_name_full }}</w:t>
+        <w:t>Name Mr {{ consumer_name }}                                        Name: {{ vendor_name_full }}</w:t>
       </w:r>
     </w:p>
     <w:p>
@@ -7066,11 +7072,23 @@
         <w:ind w:left="119"/>
       </w:pPr>
       <w:r>
-        <w:t xml:space="preserve">Address: {{ consumer_residential_address }}</w:t>
+        <w:t>Address: {{ consumer_residential_address }}</w:t>
+      </w:r>
+      <w:r>
         <w:tab/>
+      </w:r>
+      <w:r>
         <w:tab/>
+      </w:r>
+      <w:r>
         <w:tab/>
+      </w:r>
+      <w:r>
         <w:tab/>
+      </w:r>
+      <w:bookmarkStart w:id="0" w:name="_GoBack"/>
+      <w:bookmarkEnd w:id="0"/>
+      <w:r>
         <w:t xml:space="preserve">Address: {{ vendor_address }}, </w:t>
       </w:r>
     </w:p>
@@ -7084,7 +7102,7 @@
         <w:ind w:left="119"/>
       </w:pPr>
       <w:r>
-        <w:t xml:space="preserve">{{ consumer_residential_address_suffix }}                                                        {{ vendor_address_suffix }}</w:t>
+        <w:t>{{ consumer_residential_address_suffix }}                                                        {{ vendor_address_suffix }}</w:t>
       </w:r>
     </w:p>
     <w:p>
@@ -7120,12 +7138,23 @@
         <w:ind w:left="119"/>
       </w:pPr>
       <w:r>
-        <w:t xml:space="preserve">Date: {{ agreement_date }}                                                                            Date: {{ agreement_date }}</w:t>
-      </w:r>
-      <w:bookmarkStart w:id="0" w:name="_GoBack"/>
-      <w:bookmarkEnd w:id="0"/>
-      <w:r>
-        <w:t>/06/2026</w:t>
+        <w:t xml:space="preserve">Date: </w:t>
+      </w:r>
+      <w:proofErr w:type="gramStart"/>
+      <w:r>
+        <w:t>{{ agreement</w:t>
+      </w:r>
+      <w:proofErr w:type="gramEnd"/>
+      <w:r>
+        <w:t xml:space="preserve">_date }}                                                            Date: {{ </w:t>
+      </w:r>
+      <w:proofErr w:type="spellStart"/>
+      <w:r>
+        <w:t>agreement_date</w:t>
+      </w:r>
+      <w:proofErr w:type="spellEnd"/>
+      <w:r>
+        <w:t xml:space="preserve"> }}</w:t>
       </w:r>
     </w:p>
     <w:p>
@@ -8809,7 +8838,7 @@
 </file>
 
 <file path=customXml/itemProps1.xml><?xml version="1.0" encoding="utf-8"?>
-<ds:datastoreItem xmlns:ds="http://schemas.openxmlformats.org/officeDocument/2006/customXml" ds:itemID="{AF263170-9D65-42C6-8300-6BB49913F088}">
+<ds:datastoreItem xmlns:ds="http://schemas.openxmlformats.org/officeDocument/2006/customXml" ds:itemID="{32B189B7-0C3E-4BFE-A4A7-61C944BABBD1}">
   <ds:schemaRefs>
     <ds:schemaRef ds:uri="http://schemas.openxmlformats.org/officeDocument/2006/bibliography"/>
   </ds:schemaRefs>

</xml_diff>